<commit_message>
Add process-flow figure to JISARA paper
Embeds the same six-step test-loop diagram used in the HTML report into
Section 3 of the JISARA/ISCAP paper as a real inline image (not just
prose), since the ISCAP guidelines require static figures rather than
interactive diagrams. build_jisara_docx.py now supports embedding any
![caption](path) image referenced from paper-jisara.md: it packages the
PNG into word/media/, registers the relationship and content type, and
renders a full-width centered figure with an auto-numbered caption below
it, matching the existing table-caption convention.

Co-Authored-By: Claude Sonnet 5 <noreply@anthropic.com>
</commit_message>
<xml_diff>
--- a/paper/jisara/agent-poison-jisara-BLIND.docx
+++ b/paper/jisara/agent-poison-jisara-BLIND.docx
@@ -367,6 +367,88 @@
           <w:szCs w:val="18"/>
         </w:rPr>
         <w:t xml:space="preserve">Each scenario is a validated JSON record: a system prompt, a user prompt, a set of tools in standard function-calling schema, the ground-truth tool call that legitimately completes the task, the unauthorized target tool the injection tries to trigger, and mock return values giving each read-type tool both benign and injected content. A deterministic mock tool server executes every tool call the model makes; it never calls a network or an LLM, so a run is fully reproducible and the only source of variance is the model's own sampling. A multi-turn runner drives a real conversation against any OpenAI-compatible endpoint, executing whatever tool calls come back through the mock server, feeding the results back as tool messages, and repeating for up to four turns or until the model stops calling tools.</w:t>
+      </w:r>
+    </w:p>
+    <w:p>
+      <w:pPr/>
+      <w:r>
+        <w:rPr>
+          <w:rFonts w:ascii="Verdana" w:hAnsi="Verdana" w:cs="Verdana"/>
+          <w:sz w:val="18"/>
+          <w:szCs w:val="18"/>
+        </w:rPr>
+        <w:t/>
+      </w:r>
+    </w:p>
+    <w:p>
+      <w:pPr>
+        <w:jc w:val="center"/>
+      </w:pPr>
+      <w:r>
+        <w:rPr>
+          <w:noProof/>
+        </w:rPr>
+        <w:drawing>
+          <wp:inline xmlns:wp="http://schemas.openxmlformats.org/drawingml/2006/wordprocessingDrawing" distT="0" distB="0" distL="0" distR="0">
+            <wp:extent cx="5943600" cy="4225308"/>
+            <wp:effectExtent l="0" t="0" r="0" b="0"/>
+            <wp:docPr id="101" name="Figure 1"/>
+            <wp:cNvGraphicFramePr>
+              <a:graphicFrameLocks xmlns:a="http://schemas.openxmlformats.org/drawingml/2006/main" noChangeAspect="1"/>
+            </wp:cNvGraphicFramePr>
+            <a:graphic xmlns:a="http://schemas.openxmlformats.org/drawingml/2006/main">
+              <a:graphicData uri="http://schemas.openxmlformats.org/drawingml/2006/picture">
+                <pic:pic xmlns:pic="http://schemas.openxmlformats.org/drawingml/2006/picture">
+                  <pic:nvPicPr>
+                    <pic:cNvPr id="101" name="Figure 1"/>
+                    <pic:cNvPicPr/>
+                  </pic:nvPicPr>
+                  <pic:blipFill>
+                    <a:blip xmlns:r="http://schemas.openxmlformats.org/officeDocument/2006/relationships" r:embed="rIdImg1"/>
+                    <a:stretch>
+                      <a:fillRect/>
+                    </a:stretch>
+                  </pic:blipFill>
+                  <pic:spPr>
+                    <a:xfrm>
+                      <a:off x="0" y="0"/>
+                      <a:ext cx="5943600" cy="4225308"/>
+                    </a:xfrm>
+                    <a:prstGeom prst="rect">
+                      <a:avLst/>
+                    </a:prstGeom>
+                  </pic:spPr>
+                </pic:pic>
+              </a:graphicData>
+            </a:graphic>
+          </wp:inline>
+        </w:drawing>
+      </w:r>
+    </w:p>
+    <w:p>
+      <w:pPr>
+        <w:jc w:val="center"/>
+      </w:pPr>
+      <w:r>
+        <w:rPr>
+          <w:rFonts w:ascii="Verdana" w:hAnsi="Verdana" w:cs="Verdana"/>
+          <w:b/>
+          <w:bCs/>
+          <w:sz w:val="18"/>
+          <w:szCs w:val="18"/>
+        </w:rPr>
+        <w:t xml:space="preserve">Figure 1. The test loop: the model picks a tool, the mock server returns clean or injected content, the active defense filters it, and the model's next move is scored as hijacked, task completed, or refused. Repeats for up to four turns.</w:t>
+      </w:r>
+    </w:p>
+    <w:p>
+      <w:pPr/>
+      <w:r>
+        <w:rPr>
+          <w:rFonts w:ascii="Verdana" w:hAnsi="Verdana" w:cs="Verdana"/>
+          <w:sz w:val="18"/>
+          <w:szCs w:val="18"/>
+        </w:rPr>
+        <w:t/>
       </w:r>
     </w:p>
     <w:p>

</xml_diff>